<commit_message>
v0.10g+: representation-vs-prediction reframe; FIA-on-FIA limitation in section 4.7.1
</commit_message>
<xml_diff>
--- a/manuscript/CSPI_v10_FEM_combined.docx
+++ b/manuscript/CSPI_v10_FEM_combined.docx
@@ -524,7 +524,7 @@
       </w:r>
     </w:p>
     <w:bookmarkEnd w:id="18"/>
-    <w:bookmarkStart w:id="58" w:name="X722bb134dbfc670aa2888153d48a0977f604ac1"/>
+    <w:bookmarkStart w:id="59" w:name="X722bb134dbfc670aa2888153d48a0977f604ac1"/>
     <w:p>
       <w:pPr>
         <w:pStyle w:val="Heading1"/>
@@ -5092,7 +5092,7 @@
         <w:pStyle w:val="BodyText"/>
       </w:pPr>
       <w:r>
-        <w:t xml:space="preserve">A counterintuitive empirical finding emerges from the SITECLCD prediction test (Table S10): the</w:t>
+        <w:t xml:space="preserve">A counterintuitive empirical finding emerges from the SITECLCD recovery test (Table S10): the</w:t>
       </w:r>
       <w:r>
         <w:t xml:space="preserve"> </w:t>
@@ -5108,7 +5108,71 @@
         <w:t xml:space="preserve"> </w:t>
       </w:r>
       <w:r>
-        <w:t xml:space="preserve">outperforms L3 weighting alone (c3_L1 OOB R² = 0.806 vs c3_L3 = 0.804, both vs c3_equal = 0.802). Finer L3 weighting introduces noise from small-region PCA instability that the broader L1 averaging absorbs. The largest gain (+0.0154 R²) comes from a joint random forest using all four composites (equal + L1 + L2 + L3 → OOB R² = 0.818, RMSE = 0.419), and a parsimonious two-term model (equal + hierarchically-shrunk hier composite) reaches OOB R² = 0.815, only 0.003 short of the four-term ensemble. The equal-weight composite is therefore retained as the operational default for the v2.0.0 release; multi-level ecoregion-weighted composite families are a candidate for the v3.0.0 release where the +0.015 R² combined gain is application-meaningful. Hierarchical shrinkage of the Level III weights toward Level I/II parent means stabilizes the small-region weights at minor expense in pooled predictive accuracy.</w:t>
+        <w:t xml:space="preserve">outperforms L3 weighting alone (c3_L1 OOB R² = 0.806 vs c3_L3 = 0.804, both vs c3_equal = 0.802). Finer L3 weighting introduces noise from small-region PCA instability that the broader L1 averaging absorbs. The largest gain (+0.0154 R²) comes from a joint random forest using all four composites (equal + L1 + L2 + L3 → OOB R² = 0.818, RMSE = 0.419), and a parsimonious two-term model (equal + hierarchically-shrunk hier composite) reaches OOB R² = 0.815, only 0.003 short of the four-term ensemble. The pooled correlation between c3_equal and c3_L3 is r = 0.45, which initially looks low for two composites built from the same three z-scored components; the explanation is that the ecoregion-weighted composite is a</w:t>
+      </w:r>
+      <w:r>
+        <w:t xml:space="preserve"> </w:t>
+      </w:r>
+      <w:r>
+        <w:rPr>
+          <w:b/>
+          <w:bCs/>
+        </w:rPr>
+        <w:t xml:space="preserve">spatially-coordinated reweighting</w:t>
+      </w:r>
+      <w:r>
+        <w:t xml:space="preserve"> </w:t>
+      </w:r>
+      <w:r>
+        <w:t xml:space="preserve">rather than a global tilt, with each plot’s effective weights inherited from its ecoregion’s PC1 loadings.</w:t>
+      </w:r>
+    </w:p>
+    <w:p>
+      <w:pPr>
+        <w:pStyle w:val="BodyText"/>
+      </w:pPr>
+      <w:r>
+        <w:t xml:space="preserve">The equal-weight composite is therefore retained as the operational default for the v2.0.0 release; multi-level ecoregion-weighted composite families are a candidate for the v3.0.0 release where the +0.015 R² combined gain is application-meaningful. Hierarchical shrinkage of the Level III weights toward Level I/II parent means stabilizes the small-region weights at minor expense in pooled predictive accuracy.</w:t>
+      </w:r>
+    </w:p>
+    <w:p>
+      <w:pPr>
+        <w:pStyle w:val="BodyText"/>
+      </w:pPr>
+      <w:r>
+        <w:t xml:space="preserve">We frame this result as a</w:t>
+      </w:r>
+      <w:r>
+        <w:t xml:space="preserve"> </w:t>
+      </w:r>
+      <w:r>
+        <w:rPr>
+          <w:b/>
+          <w:bCs/>
+        </w:rPr>
+        <w:t xml:space="preserve">representation</w:t>
+      </w:r>
+      <w:r>
+        <w:t xml:space="preserve"> </w:t>
+      </w:r>
+      <w:r>
+        <w:t xml:space="preserve">finding rather than a</w:t>
+      </w:r>
+      <w:r>
+        <w:t xml:space="preserve"> </w:t>
+      </w:r>
+      <w:r>
+        <w:rPr>
+          <w:b/>
+          <w:bCs/>
+        </w:rPr>
+        <w:t xml:space="preserve">prediction</w:t>
+      </w:r>
+      <w:r>
+        <w:t xml:space="preserve"> </w:t>
+      </w:r>
+      <w:r>
+        <w:t xml:space="preserve">finding. Because SITECLCD is computed from per-FIA-region growth equations and our four productivity measures are also FIA-derived (ESI v7 is trained on the unified North America compilation that includes FIA, BGI and Asym are computed directly from FIA remeasurement and AGB pairs), the +0.015 R² gain partly reflects the ecoregional structure that FIA itself uses in calibrating SITECLCD. The composite recovers what FIA’s classification has been doing, in the same way that the SICOND × BGI correlation in §3.5 reflects what FIA’s per-region SI equations have absorbed. An independent prediction validation against productivity measurements outside the FIA system (long-term carbon-sequestration rates from non-FIA permanent plots, or net primary production at non-FIA tower sites) would be required to make a stronger claim about true site-quality prediction. We discuss this distinction further in §4.7.</w:t>
       </w:r>
     </w:p>
     <w:bookmarkEnd w:id="35"/>
@@ -6972,7 +7036,7 @@
     </w:p>
     <w:bookmarkEnd w:id="39"/>
     <w:bookmarkEnd w:id="40"/>
-    <w:bookmarkStart w:id="50" w:name="discussion"/>
+    <w:bookmarkStart w:id="51" w:name="discussion"/>
     <w:p>
       <w:pPr>
         <w:pStyle w:val="Heading2"/>
@@ -7285,12 +7349,46 @@
       </w:r>
     </w:p>
     <w:bookmarkEnd w:id="48"/>
-    <w:bookmarkStart w:id="49" w:name="limitations"/>
+    <w:bookmarkStart w:id="49" w:name="X9e4293d70d9e0bafbc2e5517d8b565b24cce7fd"/>
     <w:p>
       <w:pPr>
         <w:pStyle w:val="Heading3"/>
       </w:pPr>
       <w:r>
+        <w:t xml:space="preserve">4.7.1 FIA-on-FIA representation, not independent prediction</w:t>
+      </w:r>
+    </w:p>
+    <w:p>
+      <w:pPr>
+        <w:pStyle w:val="FirstParagraph"/>
+      </w:pPr>
+      <w:r>
+        <w:t xml:space="preserve">A reviewer-style stress test of the SITECLCD random-forest result and the multilevel ecoregion analysis must acknowledge the validation chain. SITECLCD is computed by FIA from regionally-calibrated growth equations. Our ESI v7 component is a random forest prediction of the unified North America height-and-age compilation, which includes the FIA Phase 2 height-and-age records as a major source. BGI and Asym are derived directly from FIA remeasurement and AGB pairs. All five measures in our composite analyses therefore share a substantial degree of common FIA-derived structure. The OOB R² = 0.808 (BGI alone predicting SITECLCD) and the +0.015 R² gain from the multilevel ecoregion composite (§3.9) reflect the field’s ability to recover its own classification rules within its own measurement system.</w:t>
+      </w:r>
+    </w:p>
+    <w:p>
+      <w:pPr>
+        <w:pStyle w:val="BodyText"/>
+      </w:pPr>
+      <w:r>
+        <w:t xml:space="preserve">This is empirically meaningful as a representation result: the data show what FIA SITECLCD is in terms of multi-dimensional productivity structure, and they show that the multi-dimensional composite recovers the classification more faithfully than any single component. It is not a strong claim about absolute site-quality prediction in an FIA-independent sense. An honest peer-reviewed reading is that the composite is a better operational proxy for what U.S. forest practitioners are already using SITECLCD to do, not that the composite is the best site-quality measure available.</w:t>
+      </w:r>
+    </w:p>
+    <w:p>
+      <w:pPr>
+        <w:pStyle w:val="BodyText"/>
+      </w:pPr>
+      <w:r>
+        <w:t xml:space="preserve">An independent prediction validation would require: (a) long-term carbon-sequestration rates from non-FIA permanent forest research plots (e.g., USFS Long-Term Ecological Research network plots), (b) net primary production at AmeriFlux tower sites, or (c) commercial growth-and-yield records from intensively managed plantations with calibrated yield curves. Such validation is planned for the v3.0.0 release cycle.</w:t>
+      </w:r>
+    </w:p>
+    <w:bookmarkEnd w:id="49"/>
+    <w:bookmarkStart w:id="50" w:name="limitations"/>
+    <w:p>
+      <w:pPr>
+        <w:pStyle w:val="Heading3"/>
+      </w:pPr>
+      <w:r>
         <w:t xml:space="preserve">4.8 Limitations</w:t>
       </w:r>
     </w:p>
@@ -7318,9 +7416,9 @@
         <w:t xml:space="preserve">The unified North America site index compilation that supplies the ESI training response is described in a companion methods note (Weiskittel et al., in preparation). The fitted equations and the underlying records are included as supplementary data in the Zenodo deposit so that the present manuscript is not coupled to the methods note’s acceptance.</w:t>
       </w:r>
     </w:p>
-    <w:bookmarkEnd w:id="49"/>
     <w:bookmarkEnd w:id="50"/>
-    <w:bookmarkStart w:id="51" w:name="conclusions"/>
+    <w:bookmarkEnd w:id="51"/>
+    <w:bookmarkStart w:id="52" w:name="conclusions"/>
     <w:p>
       <w:pPr>
         <w:pStyle w:val="Heading2"/>
@@ -7361,8 +7459,8 @@
         <w:t xml:space="preserve">We release a 3-component Composite Site Productivity Index (CSPI v2; ESI + BGI + Asym, equal weight z-score average) at 30 m as one operationalization of the multi-dimensional view, alongside the four component layers and FIA SICOND as standalone citable products so that downstream users can decompose the composite or use the measure that fits their application. The deposit is at Zenodo concept DOI 10.5281/zenodo.20515034, version 2.0.0 at 10.5281/zenodo.20663652. The v2.0.0 release ships the lightweight 1 km surface and supporting documentation; the 30 m surfaces will follow in v2.1.0 after Zenodo quota approval.</w:t>
       </w:r>
     </w:p>
-    <w:bookmarkEnd w:id="51"/>
-    <w:bookmarkStart w:id="52" w:name="author-contributions-credit"/>
+    <w:bookmarkEnd w:id="52"/>
+    <w:bookmarkStart w:id="53" w:name="author-contributions-credit"/>
     <w:p>
       <w:pPr>
         <w:pStyle w:val="Heading2"/>
@@ -7379,8 +7477,8 @@
         <w:t xml:space="preserve">Aaron R. Weiskittel: Conceptualization, Methodology, Software, Validation, Formal analysis, Investigation, Resources, Data curation, Writing — original draft, Writing — review and editing, Visualization, Supervision, Project administration, Funding acquisition.</w:t>
       </w:r>
     </w:p>
-    <w:bookmarkEnd w:id="52"/>
-    <w:bookmarkStart w:id="53" w:name="declaration-of-competing-interests-1"/>
+    <w:bookmarkEnd w:id="53"/>
+    <w:bookmarkStart w:id="54" w:name="declaration-of-competing-interests-1"/>
     <w:p>
       <w:pPr>
         <w:pStyle w:val="Heading2"/>
@@ -7397,8 +7495,8 @@
         <w:t xml:space="preserve">The author declares no competing interests.</w:t>
       </w:r>
     </w:p>
-    <w:bookmarkEnd w:id="53"/>
-    <w:bookmarkStart w:id="54" w:name="declaration-of-generative-ai-use-1"/>
+    <w:bookmarkEnd w:id="54"/>
+    <w:bookmarkStart w:id="55" w:name="declaration-of-generative-ai-use-1"/>
     <w:p>
       <w:pPr>
         <w:pStyle w:val="Heading2"/>
@@ -7415,8 +7513,8 @@
         <w:t xml:space="preserve">During the preparation of this work the author used Claude (Anthropic) for structural organization, consistency checking, and code drafting in the analytical pipeline. The author reviewed and edited all output and takes full responsibility for the content of the publication.</w:t>
       </w:r>
     </w:p>
-    <w:bookmarkEnd w:id="54"/>
-    <w:bookmarkStart w:id="55" w:name="acknowledgments"/>
+    <w:bookmarkEnd w:id="55"/>
+    <w:bookmarkStart w:id="56" w:name="acknowledgments"/>
     <w:p>
       <w:pPr>
         <w:pStyle w:val="Heading2"/>
@@ -7433,8 +7531,8 @@
         <w:t xml:space="preserve">This work was supported by the USDA National Institute of Food and Agriculture, McIntire-Stennis Forestry Research Program (Maine Agricultural and Forest Experiment Station), with supplemental support from the University of Maine Center for Research on Sustainable Forests. [PLACEHOLDER: confirm specific NIFA McIntire-Stennis project number.] The unified North America site index compilation that supplies the response variable is being developed under a separate methods note in preparation. Computation was performed on the Ohio Supercomputer Center Cardinal cluster under allocation PUOM0008.</w:t>
       </w:r>
     </w:p>
-    <w:bookmarkEnd w:id="55"/>
-    <w:bookmarkStart w:id="56" w:name="data-and-code-availability"/>
+    <w:bookmarkEnd w:id="56"/>
+    <w:bookmarkStart w:id="57" w:name="data-and-code-availability"/>
     <w:p>
       <w:pPr>
         <w:pStyle w:val="Heading2"/>
@@ -7451,8 +7549,8 @@
         <w:t xml:space="preserve">CSPI v2.0.0 is at 10.5281/zenodo.20663652 (concept 10.5281/zenodo.20515034), CC-BY-4.0. The release contains the recommended 1 km ESI v6 surface, MOD17A3HGF NPP at 500 m, and documentation; the full 30 m surfaces follow in v2.1.0. The SICOND-target v3 and v4 surfaces from v1.0.0 (10.5281/zenodo.20515035) remain available. Pipeline at https://github.com/holoros/fvs-conus.</w:t>
       </w:r>
     </w:p>
-    <w:bookmarkEnd w:id="56"/>
-    <w:bookmarkStart w:id="57" w:name="references"/>
+    <w:bookmarkEnd w:id="57"/>
+    <w:bookmarkStart w:id="58" w:name="references"/>
     <w:p>
       <w:pPr>
         <w:pStyle w:val="Heading2"/>
@@ -7573,9 +7671,9 @@
         <w:t xml:space="preserve">Weiskittel, A. R. et al. (in preparation). The unified North America site index compilation.</w:t>
       </w:r>
     </w:p>
-    <w:bookmarkEnd w:id="57"/>
     <w:bookmarkEnd w:id="58"/>
-    <w:bookmarkStart w:id="92" w:name="figures"/>
+    <w:bookmarkEnd w:id="59"/>
+    <w:bookmarkStart w:id="93" w:name="figures"/>
     <w:p>
       <w:pPr>
         <w:pStyle w:val="Heading1"/>
@@ -7593,18 +7691,18 @@
           <wp:inline>
             <wp:extent cx="3972593" cy="3611727"/>
             <wp:effectExtent b="0" l="0" r="0" t="0"/>
-            <wp:docPr descr="Figure 1. Correlation heatmap of the four CSPI components." title="" id="60" name="Picture"/>
+            <wp:docPr descr="Figure 1. Correlation heatmap of the four CSPI components." title="" id="61" name="Picture"/>
             <a:graphic>
               <a:graphicData uri="http://schemas.openxmlformats.org/drawingml/2006/picture">
                 <pic:pic>
                   <pic:nvPicPr>
-                    <pic:cNvPr descr="figures_v04/F1_cor_heatmap.png" id="61" name="Picture"/>
+                    <pic:cNvPr descr="figures_v04/F1_cor_heatmap.png" id="62" name="Picture"/>
                     <pic:cNvPicPr>
                       <a:picLocks noChangeArrowheads="1" noChangeAspect="1"/>
                     </pic:cNvPicPr>
                   </pic:nvPicPr>
                   <pic:blipFill>
-                    <a:blip r:embed="rId59"/>
+                    <a:blip r:embed="rId60"/>
                     <a:stretch>
                       <a:fillRect/>
                     </a:stretch>
@@ -7648,18 +7746,18 @@
           <wp:inline>
             <wp:extent cx="5334000" cy="2756548"/>
             <wp:effectExtent b="0" l="0" r="0" t="0"/>
-            <wp:docPr descr="Figure 2. Standardized component distributions." title="" id="63" name="Picture"/>
+            <wp:docPr descr="Figure 2. Standardized component distributions." title="" id="64" name="Picture"/>
             <a:graphic>
               <a:graphicData uri="http://schemas.openxmlformats.org/drawingml/2006/picture">
                 <pic:pic>
                   <pic:nvPicPr>
-                    <pic:cNvPr descr="figures_v04/F2_component_ridges.png" id="64" name="Picture"/>
+                    <pic:cNvPr descr="figures_v04/F2_component_ridges.png" id="65" name="Picture"/>
                     <pic:cNvPicPr>
                       <a:picLocks noChangeArrowheads="1" noChangeAspect="1"/>
                     </pic:cNvPicPr>
                   </pic:nvPicPr>
                   <pic:blipFill>
-                    <a:blip r:embed="rId62"/>
+                    <a:blip r:embed="rId63"/>
                     <a:stretch>
                       <a:fillRect/>
                     </a:stretch>
@@ -7703,18 +7801,18 @@
           <wp:inline>
             <wp:extent cx="5334000" cy="3371710"/>
             <wp:effectExtent b="0" l="0" r="0" t="0"/>
-            <wp:docPr descr="Figure 3. Composite by latitude band." title="" id="66" name="Picture"/>
+            <wp:docPr descr="Figure 3. Composite by latitude band." title="" id="67" name="Picture"/>
             <a:graphic>
               <a:graphicData uri="http://schemas.openxmlformats.org/drawingml/2006/picture">
                 <pic:pic>
                   <pic:nvPicPr>
-                    <pic:cNvPr descr="figures_v04/F3_composite_by_latband.png" id="67" name="Picture"/>
+                    <pic:cNvPr descr="figures_v04/F3_composite_by_latband.png" id="68" name="Picture"/>
                     <pic:cNvPicPr>
                       <a:picLocks noChangeArrowheads="1" noChangeAspect="1"/>
                     </pic:cNvPicPr>
                   </pic:nvPicPr>
                   <pic:blipFill>
-                    <a:blip r:embed="rId65"/>
+                    <a:blip r:embed="rId66"/>
                     <a:stretch>
                       <a:fillRect/>
                     </a:stretch>
@@ -7758,18 +7856,18 @@
           <wp:inline>
             <wp:extent cx="5334000" cy="3065427"/>
             <wp:effectExtent b="0" l="0" r="0" t="0"/>
-            <wp:docPr descr="Figure S6. CV R² across ESI versions (moved from main to supplementary per Reviewer 1 / self-review distillation pass)." title="" id="69" name="Picture"/>
+            <wp:docPr descr="Figure S6. CV R² across ESI versions (moved from main to supplementary per Reviewer 1 / self-review distillation pass)." title="" id="70" name="Picture"/>
             <a:graphic>
               <a:graphicData uri="http://schemas.openxmlformats.org/drawingml/2006/picture">
                 <pic:pic>
                   <pic:nvPicPr>
-                    <pic:cNvPr descr="figures_v04/F4_cv_bar_versions.png" id="70" name="Picture"/>
+                    <pic:cNvPr descr="figures_v04/F4_cv_bar_versions.png" id="71" name="Picture"/>
                     <pic:cNvPicPr>
                       <a:picLocks noChangeArrowheads="1" noChangeAspect="1"/>
                     </pic:cNvPicPr>
                   </pic:nvPicPr>
                   <pic:blipFill>
-                    <a:blip r:embed="rId68"/>
+                    <a:blip r:embed="rId69"/>
                     <a:stretch>
                       <a:fillRect/>
                     </a:stretch>
@@ -7813,18 +7911,18 @@
           <wp:inline>
             <wp:extent cx="5334000" cy="3371710"/>
             <wp:effectExtent b="0" l="0" r="0" t="0"/>
-            <wp:docPr descr="Figure S7. Variable importance v7 vs v8 (moved from main to supplementary per distillation pass)." title="" id="72" name="Picture"/>
+            <wp:docPr descr="Figure S7. Variable importance v7 vs v8 (moved from main to supplementary per distillation pass)." title="" id="73" name="Picture"/>
             <a:graphic>
               <a:graphicData uri="http://schemas.openxmlformats.org/drawingml/2006/picture">
                 <pic:pic>
                   <pic:nvPicPr>
-                    <pic:cNvPr descr="figures_v04/F5_variable_importance.png" id="73" name="Picture"/>
+                    <pic:cNvPr descr="figures_v04/F5_variable_importance.png" id="74" name="Picture"/>
                     <pic:cNvPicPr>
                       <a:picLocks noChangeArrowheads="1" noChangeAspect="1"/>
                     </pic:cNvPicPr>
                   </pic:nvPicPr>
                   <pic:blipFill>
-                    <a:blip r:embed="rId71"/>
+                    <a:blip r:embed="rId72"/>
                     <a:stretch>
                       <a:fillRect/>
                     </a:stretch>
@@ -7868,18 +7966,18 @@
           <wp:inline>
             <wp:extent cx="5334000" cy="4290560"/>
             <wp:effectExtent b="0" l="0" r="0" t="0"/>
-            <wp:docPr descr="Figure 6. Components vs composite scatter." title="" id="75" name="Picture"/>
+            <wp:docPr descr="Figure 6. Components vs composite scatter." title="" id="76" name="Picture"/>
             <a:graphic>
               <a:graphicData uri="http://schemas.openxmlformats.org/drawingml/2006/picture">
                 <pic:pic>
                   <pic:nvPicPr>
-                    <pic:cNvPr descr="figures_v04/F6_component_vs_composite.png" id="76" name="Picture"/>
+                    <pic:cNvPr descr="figures_v04/F6_component_vs_composite.png" id="77" name="Picture"/>
                     <pic:cNvPicPr>
                       <a:picLocks noChangeArrowheads="1" noChangeAspect="1"/>
                     </pic:cNvPicPr>
                   </pic:nvPicPr>
                   <pic:blipFill>
-                    <a:blip r:embed="rId74"/>
+                    <a:blip r:embed="rId75"/>
                     <a:stretch>
                       <a:fillRect/>
                     </a:stretch>
@@ -7923,18 +8021,18 @@
           <wp:inline>
             <wp:extent cx="5334000" cy="3200399"/>
             <wp:effectExtent b="0" l="0" r="0" t="0"/>
-            <wp:docPr descr="Figure 7. Wall-to-wall CSPI v2 3-component composite (ESI v7 + BGI + Asym) at 30 m, displayed at 1 km. z-score equal-weight average over CONUS, rescaled to 0-100. Pacific Northwest coastal forest band highest; southwestern interior margin lowest; southeastern coastal plain and central hardwood region intermediate." title="" id="78" name="Picture"/>
+            <wp:docPr descr="Figure 7. Wall-to-wall CSPI v2 3-component composite (ESI v7 + BGI + Asym) at 30 m, displayed at 1 km. z-score equal-weight average over CONUS, rescaled to 0-100. Pacific Northwest coastal forest band highest; southwestern interior margin lowest; southeastern coastal plain and central hardwood region intermediate." title="" id="79" name="Picture"/>
             <a:graphic>
               <a:graphicData uri="http://schemas.openxmlformats.org/drawingml/2006/picture">
                 <pic:pic>
                   <pic:nvPicPr>
-                    <pic:cNvPr descr="figures_v10/F7_cspi_v21_3c_map.png" id="79" name="Picture"/>
+                    <pic:cNvPr descr="figures_v10/F7_cspi_v21_3c_map.png" id="80" name="Picture"/>
                     <pic:cNvPicPr>
                       <a:picLocks noChangeArrowheads="1" noChangeAspect="1"/>
                     </pic:cNvPicPr>
                   </pic:nvPicPr>
                   <pic:blipFill>
-                    <a:blip r:embed="rId77"/>
+                    <a:blip r:embed="rId78"/>
                     <a:stretch>
                       <a:fillRect/>
                     </a:stretch>
@@ -7978,18 +8076,18 @@
           <wp:inline>
             <wp:extent cx="5334000" cy="3065427"/>
             <wp:effectExtent b="0" l="0" r="0" t="0"/>
-            <wp:docPr descr="Figure 8. Mean productivity measure by FIA SITECLCD class. Site index is essentially flat across the seven classes while biomass growth tracks the classification monotonically; the 3-component composite tracks the classification." title="" id="81" name="Picture"/>
+            <wp:docPr descr="Figure 8. Mean productivity measure by FIA SITECLCD class. Site index is essentially flat across the seven classes while biomass growth tracks the classification monotonically; the 3-component composite tracks the classification." title="" id="82" name="Picture"/>
             <a:graphic>
               <a:graphicData uri="http://schemas.openxmlformats.org/drawingml/2006/picture">
                 <pic:pic>
                   <pic:nvPicPr>
-                    <pic:cNvPr descr="figures_v10/F8_siteclcd_by_measure.png" id="82" name="Picture"/>
+                    <pic:cNvPr descr="figures_v10/F8_siteclcd_by_measure.png" id="83" name="Picture"/>
                     <pic:cNvPicPr>
                       <a:picLocks noChangeArrowheads="1" noChangeAspect="1"/>
                     </pic:cNvPicPr>
                   </pic:nvPicPr>
                   <pic:blipFill>
-                    <a:blip r:embed="rId80"/>
+                    <a:blip r:embed="rId81"/>
                     <a:stretch>
                       <a:fillRect/>
                     </a:stretch>
@@ -8033,18 +8131,18 @@
           <wp:inline>
             <wp:extent cx="5334000" cy="3065427"/>
             <wp:effectExtent b="0" l="0" r="0" t="0"/>
-            <wp:docPr descr="Figure 9. ESI-BGI correlation by stand age bin. The correlation is negative in young to middle-age stands and flips to positive in old growth, demonstrating that a productivity surface trained pooled across stand ages is wrong in opposite directions in young versus old stands." title="" id="84" name="Picture"/>
+            <wp:docPr descr="Figure 9. ESI-BGI correlation by stand age bin. The correlation is negative in young to middle-age stands and flips to positive in old growth, demonstrating that a productivity surface trained pooled across stand ages is wrong in opposite directions in young versus old stands." title="" id="85" name="Picture"/>
             <a:graphic>
               <a:graphicData uri="http://schemas.openxmlformats.org/drawingml/2006/picture">
                 <pic:pic>
                   <pic:nvPicPr>
-                    <pic:cNvPr descr="figures_v10/F9_stand_age_correlation.png" id="85" name="Picture"/>
+                    <pic:cNvPr descr="figures_v10/F9_stand_age_correlation.png" id="86" name="Picture"/>
                     <pic:cNvPicPr>
                       <a:picLocks noChangeArrowheads="1" noChangeAspect="1"/>
                     </pic:cNvPicPr>
                   </pic:nvPicPr>
                   <pic:blipFill>
-                    <a:blip r:embed="rId83"/>
+                    <a:blip r:embed="rId84"/>
                     <a:stretch>
                       <a:fillRect/>
                     </a:stretch>
@@ -8088,18 +8186,18 @@
           <wp:inline>
             <wp:extent cx="5334000" cy="3677994"/>
             <wp:effectExtent b="0" l="0" r="0" t="0"/>
-            <wp:docPr descr="Figure 10. ESI-BGI correlation by major species, ordered. The pooled correlation of -0.45 masks per-species variation from r = 0.028 (yellow-poplar) to r = 0.492 (Douglas-fir); a single national productivity ranking implicitly assumes one relationship across all species, but the data show the relationship differs by half an r unit." title="" id="87" name="Picture"/>
+            <wp:docPr descr="Figure 10. ESI-BGI correlation by major species, ordered. The pooled correlation of -0.45 masks per-species variation from r = 0.028 (yellow-poplar) to r = 0.492 (Douglas-fir); a single national productivity ranking implicitly assumes one relationship across all species, but the data show the relationship differs by half an r unit." title="" id="88" name="Picture"/>
             <a:graphic>
               <a:graphicData uri="http://schemas.openxmlformats.org/drawingml/2006/picture">
                 <pic:pic>
                   <pic:nvPicPr>
-                    <pic:cNvPr descr="figures_v10/F10_per_species_ESI_BGI.png" id="88" name="Picture"/>
+                    <pic:cNvPr descr="figures_v10/F10_per_species_ESI_BGI.png" id="89" name="Picture"/>
                     <pic:cNvPicPr>
                       <a:picLocks noChangeArrowheads="1" noChangeAspect="1"/>
                     </pic:cNvPicPr>
                   </pic:nvPicPr>
                   <pic:blipFill>
-                    <a:blip r:embed="rId86"/>
+                    <a:blip r:embed="rId87"/>
                     <a:stretch>
                       <a:fillRect/>
                     </a:stretch>
@@ -8143,18 +8241,18 @@
           <wp:inline>
             <wp:extent cx="5334000" cy="3200400"/>
             <wp:effectExtent b="0" l="0" r="0" t="0"/>
-            <wp:docPr descr="Figure 11. Decision tree for choosing among ESI, BGI, Asym, NPP, and the CSPI v2 composite by application context. Each leaf box names the use case, the natural caveat, and a numerical anchor; the bottom panel summarizes three common failure modes of single-metric productivity studies (the SITECLCD ranking, the stand-age sign flip at 120 years, and species heterogeneity in the ESI-BGI correlation)." title="" id="90" name="Picture"/>
+            <wp:docPr descr="Figure 11. Decision tree for choosing among ESI, BGI, Asym, NPP, and the CSPI v2 composite by application context. Each leaf box names the use case, the natural caveat, and a numerical anchor; the bottom panel summarizes three common failure modes of single-metric productivity studies (the SITECLCD ranking, the stand-age sign flip at 120 years, and species heterogeneity in the ESI-BGI correlation)." title="" id="91" name="Picture"/>
             <a:graphic>
               <a:graphicData uri="http://schemas.openxmlformats.org/drawingml/2006/picture">
                 <pic:pic>
                   <pic:nvPicPr>
-                    <pic:cNvPr descr="figures_v10/F11_decision_tree.png" id="91" name="Picture"/>
+                    <pic:cNvPr descr="figures_v10/F11_decision_tree.png" id="92" name="Picture"/>
                     <pic:cNvPicPr>
                       <a:picLocks noChangeArrowheads="1" noChangeAspect="1"/>
                     </pic:cNvPicPr>
                   </pic:nvPicPr>
                   <pic:blipFill>
-                    <a:blip r:embed="rId89"/>
+                    <a:blip r:embed="rId90"/>
                     <a:stretch>
                       <a:fillRect/>
                     </a:stretch>
@@ -8189,8 +8287,8 @@
         <w:t xml:space="preserve">Figure 11. Decision tree for choosing among ESI, BGI, Asym, NPP, and the CSPI v2 composite by application context. Each leaf box names the use case, the natural caveat, and a numerical anchor; the bottom panel summarizes three common failure modes of single-metric productivity studies (the SITECLCD ranking, the stand-age sign flip at 120 years, and species heterogeneity in the ESI-BGI correlation).</w:t>
       </w:r>
     </w:p>
-    <w:bookmarkEnd w:id="92"/>
-    <w:bookmarkStart w:id="106" w:name="supplementary-materials"/>
+    <w:bookmarkEnd w:id="93"/>
+    <w:bookmarkStart w:id="107" w:name="supplementary-materials"/>
     <w:p>
       <w:pPr>
         <w:pStyle w:val="Heading1"/>
@@ -8199,7 +8297,7 @@
         <w:t xml:space="preserve">Supplementary Materials</w:t>
       </w:r>
     </w:p>
-    <w:bookmarkStart w:id="93" w:name="X439046e068d6b3e882fe7309c4bf02434e8575f"/>
+    <w:bookmarkStart w:id="94" w:name="X439046e068d6b3e882fe7309c4bf02434e8575f"/>
     <w:p>
       <w:pPr>
         <w:pStyle w:val="Heading2"/>
@@ -8235,8 +8333,8 @@
         </w:pict>
       </w:r>
     </w:p>
-    <w:bookmarkEnd w:id="93"/>
-    <w:bookmarkStart w:id="94" w:name="table-s1.-predictor-covariates"/>
+    <w:bookmarkEnd w:id="94"/>
+    <w:bookmarkStart w:id="95" w:name="table-s1.-predictor-covariates"/>
     <w:p>
       <w:pPr>
         <w:pStyle w:val="Heading2"/>
@@ -10055,8 +10153,8 @@
         </w:pict>
       </w:r>
     </w:p>
-    <w:bookmarkEnd w:id="94"/>
-    <w:bookmarkStart w:id="95" w:name="X2383b4cabd14e9ff0ac05669f15dac7f70c0ba4"/>
+    <w:bookmarkEnd w:id="95"/>
+    <w:bookmarkStart w:id="96" w:name="X2383b4cabd14e9ff0ac05669f15dac7f70c0ba4"/>
     <w:p>
       <w:pPr>
         <w:pStyle w:val="Heading2"/>
@@ -10673,8 +10771,8 @@
         </w:pict>
       </w:r>
     </w:p>
-    <w:bookmarkEnd w:id="95"/>
-    <w:bookmarkStart w:id="96" w:name="X1101e62b7bf46969046dcc50544d92939d9b923"/>
+    <w:bookmarkEnd w:id="96"/>
+    <w:bookmarkStart w:id="97" w:name="X1101e62b7bf46969046dcc50544d92939d9b923"/>
     <w:p>
       <w:pPr>
         <w:pStyle w:val="Heading2"/>
@@ -10953,8 +11051,8 @@
         </w:pict>
       </w:r>
     </w:p>
-    <w:bookmarkEnd w:id="96"/>
-    <w:bookmarkStart w:id="97" w:name="X0c3d55c1facf3b81681a623f441d557263cc2bf"/>
+    <w:bookmarkEnd w:id="97"/>
+    <w:bookmarkStart w:id="98" w:name="X0c3d55c1facf3b81681a623f441d557263cc2bf"/>
     <w:p>
       <w:pPr>
         <w:pStyle w:val="Heading2"/>
@@ -11409,8 +11507,8 @@
         </w:pict>
       </w:r>
     </w:p>
-    <w:bookmarkEnd w:id="97"/>
-    <w:bookmarkStart w:id="98" w:name="X8acbd9aaaf141e012f4259ab6f6cea32d6510c0"/>
+    <w:bookmarkEnd w:id="98"/>
+    <w:bookmarkStart w:id="99" w:name="X8acbd9aaaf141e012f4259ab6f6cea32d6510c0"/>
     <w:p>
       <w:pPr>
         <w:pStyle w:val="Heading2"/>
@@ -11851,8 +11949,8 @@
         </w:pict>
       </w:r>
     </w:p>
-    <w:bookmarkEnd w:id="98"/>
-    <w:bookmarkStart w:id="104" w:name="methods-notes"/>
+    <w:bookmarkEnd w:id="99"/>
+    <w:bookmarkStart w:id="105" w:name="methods-notes"/>
     <w:p>
       <w:pPr>
         <w:pStyle w:val="Heading2"/>
@@ -11861,7 +11959,7 @@
         <w:t xml:space="preserve">Methods notes</w:t>
       </w:r>
     </w:p>
-    <w:bookmarkStart w:id="99" w:name="X0e2719587354c57b76d3e4e949a7925790dfabd"/>
+    <w:bookmarkStart w:id="100" w:name="X0e2719587354c57b76d3e4e949a7925790dfabd"/>
     <w:p>
       <w:pPr>
         <w:pStyle w:val="Heading3"/>
@@ -11898,8 +11996,8 @@
         <w:t xml:space="preserve">The QRF surface predict is implemented as a 40-tile SLURM array (each tile is a latitude row of the CONUS 30 m grid, ~2,300 rows per tile, processed independently with the same trained QRF model). A separate merge job stitches the 40 single-tile rasters into the released 4-band raster (p05, p50, p95, width90).</w:t>
       </w:r>
     </w:p>
-    <w:bookmarkEnd w:id="99"/>
-    <w:bookmarkStart w:id="100" w:name="m2.-composite-z-score-parameters"/>
+    <w:bookmarkEnd w:id="100"/>
+    <w:bookmarkStart w:id="101" w:name="m2.-composite-z-score-parameters"/>
     <w:p>
       <w:pPr>
         <w:pStyle w:val="Heading3"/>
@@ -12126,8 +12224,8 @@
         <w:t xml:space="preserve">in the deposit) so the wall-to-wall surface uses the same standardization as the plot-level composite.</w:t>
       </w:r>
     </w:p>
-    <w:bookmarkEnd w:id="100"/>
-    <w:bookmarkStart w:id="101" w:name="X0754cbcac77bead784721c51cd00da45e4ddfad"/>
+    <w:bookmarkEnd w:id="101"/>
+    <w:bookmarkStart w:id="102" w:name="X0754cbcac77bead784721c51cd00da45e4ddfad"/>
     <w:p>
       <w:pPr>
         <w:pStyle w:val="Heading3"/>
@@ -12177,8 +12275,8 @@
         <w:t xml:space="preserve">against the reprojected stack. The fast path completed in 3:03 with the same numerical output (composite z-score parameters identical at the FIA plot set, as expected since the standardization layer is identical).</w:t>
       </w:r>
     </w:p>
-    <w:bookmarkEnd w:id="101"/>
-    <w:bookmarkStart w:id="102" w:name="m4.-forest-mask"/>
+    <w:bookmarkEnd w:id="102"/>
+    <w:bookmarkStart w:id="103" w:name="m4.-forest-mask"/>
     <w:p>
       <w:pPr>
         <w:pStyle w:val="Heading3"/>
@@ -12210,8 +12308,8 @@
         <w:t xml:space="preserve">to each released forest-mask layer.</w:t>
       </w:r>
     </w:p>
-    <w:bookmarkEnd w:id="102"/>
-    <w:bookmarkStart w:id="103" w:name="X48146207b17ee42495c4d27eb49be26be44ad3d"/>
+    <w:bookmarkEnd w:id="103"/>
+    <w:bookmarkStart w:id="104" w:name="X48146207b17ee42495c4d27eb49be26be44ad3d"/>
     <w:p>
       <w:pPr>
         <w:pStyle w:val="Heading3"/>
@@ -12235,9 +12333,9 @@
         </w:pict>
       </w:r>
     </w:p>
-    <w:bookmarkEnd w:id="103"/>
     <w:bookmarkEnd w:id="104"/>
-    <w:bookmarkStart w:id="105" w:name="figures-s1s5-deferred"/>
+    <w:bookmarkEnd w:id="105"/>
+    <w:bookmarkStart w:id="106" w:name="figures-s1s5-deferred"/>
     <w:p>
       <w:pPr>
         <w:pStyle w:val="Heading2"/>
@@ -12357,8 +12455,8 @@
         <w:t xml:space="preserve">S4 will land once the v7 QRF tile-array (job 11503014 + merge 11503015) completes; S5 requires an ecoregion shapefile overlay on the composite surface.</w:t>
       </w:r>
     </w:p>
-    <w:bookmarkEnd w:id="105"/>
     <w:bookmarkEnd w:id="106"/>
+    <w:bookmarkEnd w:id="107"/>
     <w:sectPr>
       <w:footnotePr>
         <w:numRestart w:val="eachSect"/>

</xml_diff>